<commit_message>
Close V29 customer release evidence and package
</commit_message>
<xml_diff>
--- a/DELIVERY/V1_1_0_VISUAL_QA/Arabic_Synthetic_Report.docx
+++ b/DELIVERY/V1_1_0_VISUAL_QA/Arabic_Synthetic_Report.docx
@@ -339,7 +339,7 @@
                     <pic:cNvPicPr/>
                   </pic:nvPicPr>
                   <pic:blipFill>
-                    <a:blip xmlns:r="http://schemas.openxmlformats.org/officeDocument/2006/relationships" r:embed="Rc0546fc0575046bd"/>
+                    <a:blip xmlns:r="http://schemas.openxmlformats.org/officeDocument/2006/relationships" r:embed="Raa7304971de34c93"/>
                     <a:stretch>
                       <a:fillRect/>
                     </a:stretch>
@@ -416,7 +416,7 @@
                     <pic:cNvPicPr/>
                   </pic:nvPicPr>
                   <pic:blipFill>
-                    <a:blip xmlns:r="http://schemas.openxmlformats.org/officeDocument/2006/relationships" r:embed="R5266579b18c64c69"/>
+                    <a:blip xmlns:r="http://schemas.openxmlformats.org/officeDocument/2006/relationships" r:embed="Racaba677ffef47e8"/>
                     <a:stretch>
                       <a:fillRect/>
                     </a:stretch>

</xml_diff>